<commit_message>
Broń podstawowa w rozpisce
Zarządzanie bieżącą bronią podstawową z poziomu rozpiski.
</commit_message>
<xml_diff>
--- a/app/static/docs/SZOP.docx
+++ b/app/static/docs/SZOP.docx
@@ -5838,25 +5838,14 @@
           <w:szCs w:val="18"/>
         </w:rPr>
       </w:pPr>
-      <w:proofErr w:type="spellStart"/>
-      <w:r>
-        <w:rPr>
-          <w:b/>
-          <w:bCs/>
-          <w:sz w:val="18"/>
-          <w:szCs w:val="18"/>
-        </w:rPr>
-        <w:t>Waagh</w:t>
-      </w:r>
-      <w:proofErr w:type="spellEnd"/>
-      <w:r>
-        <w:rPr>
-          <w:b/>
-          <w:bCs/>
-          <w:sz w:val="18"/>
-          <w:szCs w:val="18"/>
-        </w:rPr>
-        <w:t>!:</w:t>
+      <w:r>
+        <w:rPr>
+          <w:b/>
+          <w:bCs/>
+          <w:sz w:val="18"/>
+          <w:szCs w:val="18"/>
+        </w:rPr>
+        <w:t>Waagh!:</w:t>
       </w:r>
       <w:r>
         <w:rPr>
@@ -6570,7 +6559,21 @@
           <w:sz w:val="18"/>
           <w:szCs w:val="18"/>
         </w:rPr>
-        <w:t>ażde trafienie zadaje liczbę ran równą wynikowi kostki obrony.</w:t>
+        <w:t>ażde trafienie zadaje liczbę ran równą wynikowi kostki obrony</w:t>
+      </w:r>
+      <w:r>
+        <w:rPr>
+          <w:sz w:val="18"/>
+          <w:szCs w:val="18"/>
+        </w:rPr>
+        <w:t xml:space="preserve">, jeżeli nie było rzutu </w:t>
+      </w:r>
+      <w:r>
+        <w:rPr>
+          <w:sz w:val="18"/>
+          <w:szCs w:val="18"/>
+        </w:rPr>
+        <w:t>to 2.</w:t>
       </w:r>
     </w:p>
     <w:p>
@@ -7874,21 +7877,12 @@
                 <w:szCs w:val="18"/>
               </w:rPr>
             </w:pPr>
-            <w:proofErr w:type="spellStart"/>
-            <w:r>
-              <w:rPr>
-                <w:sz w:val="18"/>
-                <w:szCs w:val="18"/>
-              </w:rPr>
-              <w:t>Waagh</w:t>
-            </w:r>
-            <w:proofErr w:type="spellEnd"/>
-            <w:r>
-              <w:rPr>
-                <w:sz w:val="18"/>
-                <w:szCs w:val="18"/>
-              </w:rPr>
-              <w:t xml:space="preserve"> (-)</w:t>
+            <w:r>
+              <w:rPr>
+                <w:sz w:val="18"/>
+                <w:szCs w:val="18"/>
+              </w:rPr>
+              <w:t>Waagh (-)</w:t>
             </w:r>
           </w:p>
         </w:tc>
@@ -8569,17 +8563,8 @@
                 <w:sz w:val="18"/>
                 <w:szCs w:val="18"/>
               </w:rPr>
-              <w:t xml:space="preserve">Chimera, </w:t>
-            </w:r>
-            <w:proofErr w:type="spellStart"/>
-            <w:r>
-              <w:rPr>
-                <w:sz w:val="18"/>
-                <w:szCs w:val="18"/>
-              </w:rPr>
-              <w:t>Sentinel</w:t>
-            </w:r>
-            <w:proofErr w:type="spellEnd"/>
+              <w:t>Chimera, Sentinel</w:t>
+            </w:r>
           </w:p>
         </w:tc>
       </w:tr>
@@ -8640,17 +8625,8 @@
                 <w:sz w:val="18"/>
                 <w:szCs w:val="18"/>
               </w:rPr>
-              <w:t xml:space="preserve">Drednot, Leman </w:t>
-            </w:r>
-            <w:proofErr w:type="spellStart"/>
-            <w:r>
-              <w:rPr>
-                <w:sz w:val="18"/>
-                <w:szCs w:val="18"/>
-              </w:rPr>
-              <w:t>Russ</w:t>
-            </w:r>
-            <w:proofErr w:type="spellEnd"/>
+              <w:t>Drednot, Leman Russ</w:t>
+            </w:r>
           </w:p>
         </w:tc>
       </w:tr>
@@ -13232,21 +13208,12 @@
                 <w:szCs w:val="18"/>
               </w:rPr>
             </w:pPr>
-            <w:proofErr w:type="spellStart"/>
-            <w:r>
-              <w:rPr>
-                <w:sz w:val="18"/>
-                <w:szCs w:val="18"/>
-              </w:rPr>
-              <w:t>Waagh</w:t>
-            </w:r>
-            <w:proofErr w:type="spellEnd"/>
-            <w:r>
-              <w:rPr>
-                <w:sz w:val="18"/>
-                <w:szCs w:val="18"/>
-              </w:rPr>
-              <w:t xml:space="preserve"> (-)</w:t>
+            <w:r>
+              <w:rPr>
+                <w:sz w:val="18"/>
+                <w:szCs w:val="18"/>
+              </w:rPr>
+              <w:t>Waagh (-)</w:t>
             </w:r>
           </w:p>
         </w:tc>

</xml_diff>